<commit_message>
Proposal: move Phase 4 three weeks later
The plan still started on 28 September, which has passed. Every Phase 4
date moves by exactly three weeks, so weeks still run Monday to Sunday
and the decision still falls two days after the issue date:

- Decision by 16 October 2026 (was 25 September); start 19 October
  (was 28 September); v1.0 on 27 December (was 6 December).
- Week ranges and milestones MS-1 to MS-6 shifted to match.

Folded into revision 4, whose history row now records the move. The
PDF is re-exported with WPS; its contents page numbers are unchanged.

Co-Authored-By: Claude Opus 5.5 <noreply@anthropic.com>
</commit_message>
<xml_diff>
--- a/docs/FunType-Project-Proposal.docx
+++ b/docs/FunType-Project-Proposal.docx
@@ -415,7 +415,7 @@
                 <w:sz w:val="18"/>
                 <w:szCs w:val="18"/>
               </w:rPr>
-              <w:t>25 September 2026</w:t>
+              <w:t>16 October 2026</w:t>
             </w:r>
           </w:p>
         </w:tc>
@@ -934,7 +934,7 @@
                 <w:sz w:val="18"/>
                 <w:szCs w:val="18"/>
               </w:rPr>
-              <w:t>Submitted for approval — decision requested by 25 September 2026</w:t>
+              <w:t>Submitted for approval — decision requested by 16 October 2026</w:t>
             </w:r>
           </w:p>
         </w:tc>
@@ -1691,7 +1691,7 @@
                 <w:sz w:val="18"/>
                 <w:szCs w:val="18"/>
               </w:rPr>
-              <w:t xml:space="preserve">): the on-screen guard now compares text only and stands down for browser extensions, which had frozen the last second of a test. Risk R13 and test TC-19 added; sizes, line counts and line ranges refreshed. The plan and its dates are unchanged</w:t>
+              <w:t xml:space="preserve">): the on-screen guard now compares text only and stands down for browser extensions, which had frozen the last second of a test. Risk R13 and test TC-19 added; sizes, line counts and line ranges refreshed. The plan moved three weeks later: Phase 4 now runs 19 October – 27 December 2026, with the decision requested by 16 October</w:t>
             </w:r>
           </w:p>
         </w:tc>
@@ -25966,7 +25966,7 @@
         <w:spacing w:after="140"/>
       </w:pPr>
       <w:r>
-        <w:t>Three phases are complete. Phase 4 is what this proposal asks approval for: ten weeks from 28 September to 6 December 2026, closing the open objectives and adding coaching.</w:t>
+        <w:t>Three phases are complete. Phase 4 is what this proposal asks approval for: ten weeks from 19 October to 27 December 2026, closing the open objectives and adding coaching.</w:t>
       </w:r>
     </w:p>
     <w:p>
@@ -26712,7 +26712,7 @@
                 <w:sz w:val="18"/>
                 <w:szCs w:val="18"/>
               </w:rPr>
-              <w:t>28 Sep – 4 Oct</w:t>
+              <w:t>19–25 Oct</w:t>
             </w:r>
           </w:p>
         </w:tc>
@@ -26854,7 +26854,7 @@
                 <w:sz w:val="18"/>
                 <w:szCs w:val="18"/>
               </w:rPr>
-              <w:t>5–18 Oct</w:t>
+              <w:t>26 Oct – 8 Nov</w:t>
             </w:r>
           </w:p>
         </w:tc>
@@ -26978,7 +26978,7 @@
                 <w:sz w:val="18"/>
                 <w:szCs w:val="18"/>
               </w:rPr>
-              <w:t>19 Oct – 1 Nov</w:t>
+              <w:t>9–22 Nov</w:t>
             </w:r>
           </w:p>
         </w:tc>
@@ -27136,7 +27136,7 @@
                 <w:sz w:val="18"/>
                 <w:szCs w:val="18"/>
               </w:rPr>
-              <w:t>2–29 Nov</w:t>
+              <w:t>23 Nov – 20 Dec</w:t>
             </w:r>
           </w:p>
         </w:tc>
@@ -27258,7 +27258,7 @@
                 <w:sz w:val="18"/>
                 <w:szCs w:val="18"/>
               </w:rPr>
-              <w:t>30 Nov – 6 Dec</w:t>
+              <w:t>21–27 Dec</w:t>
             </w:r>
           </w:p>
         </w:tc>
@@ -27577,7 +27577,7 @@
                 <w:sz w:val="18"/>
                 <w:szCs w:val="18"/>
               </w:rPr>
-              <w:t>2026-10-02</w:t>
+              <w:t>2026-10-23</w:t>
             </w:r>
           </w:p>
         </w:tc>
@@ -27692,7 +27692,7 @@
                 <w:sz w:val="18"/>
                 <w:szCs w:val="18"/>
               </w:rPr>
-              <w:t>2026-10-04</w:t>
+              <w:t>2026-10-25</w:t>
             </w:r>
           </w:p>
         </w:tc>
@@ -27807,7 +27807,7 @@
                 <w:sz w:val="18"/>
                 <w:szCs w:val="18"/>
               </w:rPr>
-              <w:t>2026-10-18</w:t>
+              <w:t>2026-11-08</w:t>
             </w:r>
           </w:p>
         </w:tc>
@@ -27922,7 +27922,7 @@
                 <w:sz w:val="18"/>
                 <w:szCs w:val="18"/>
               </w:rPr>
-              <w:t>2026-11-01</w:t>
+              <w:t>2026-11-22</w:t>
             </w:r>
           </w:p>
         </w:tc>
@@ -28037,7 +28037,7 @@
                 <w:sz w:val="18"/>
                 <w:szCs w:val="18"/>
               </w:rPr>
-              <w:t>2026-11-29</w:t>
+              <w:t>2026-12-20</w:t>
             </w:r>
           </w:p>
         </w:tc>
@@ -28149,7 +28149,7 @@
                 <w:sz w:val="18"/>
                 <w:szCs w:val="18"/>
               </w:rPr>
-              <w:t>2026-12-06</w:t>
+              <w:t>2026-12-27</w:t>
             </w:r>
           </w:p>
         </w:tc>
@@ -37988,7 +37988,7 @@
                 <w:sz w:val="18"/>
                 <w:szCs w:val="18"/>
               </w:rPr>
-              <w:t>2026-09-25</w:t>
+              <w:t>2026-10-16</w:t>
             </w:r>
           </w:p>
         </w:tc>
@@ -38052,7 +38052,7 @@
                 <w:sz w:val="18"/>
                 <w:szCs w:val="18"/>
               </w:rPr>
-              <w:t>2026-09-28</w:t>
+              <w:t>2026-10-19</w:t>
             </w:r>
           </w:p>
         </w:tc>

</xml_diff>

<commit_message>
Proposal: ship v1.0 on 23 December, before Christmas
Week 10 ran 21–27 December, straight through Christmas. It is a
five-hour week like the rest, so it now runs Monday to Wednesday,
21–23 December, and MS-6 (v1.0 released) moves to 2026-12-23. The
start date, the ten-week plan, the 50 hours and the scope are unchanged.

The revision 4 history row and the plan's opening paragraph say so; the
PDF is re-exported with WPS and its contents page numbers are unchanged.

Co-Authored-By: Claude Opus 5.5 <noreply@anthropic.com>
</commit_message>
<xml_diff>
--- a/docs/FunType-Project-Proposal.docx
+++ b/docs/FunType-Project-Proposal.docx
@@ -1691,7 +1691,7 @@
                 <w:sz w:val="18"/>
                 <w:szCs w:val="18"/>
               </w:rPr>
-              <w:t xml:space="preserve">): the on-screen guard now compares text only and stands down for browser extensions, which had frozen the last second of a test. Risk R13 and test TC-19 added; sizes, line counts and line ranges refreshed. The plan moved three weeks later: Phase 4 now runs 19 October – 27 December 2026, with the decision requested by 16 October</w:t>
+              <w:t xml:space="preserve">): the on-screen guard now compares text only and stands down for browser extensions, which had frozen the last second of a test. Risk R13 and test TC-19 added; sizes, line counts and line ranges refreshed. The plan moved three weeks later, with the release week cut to three days so v1.0 ships before Christmas: Phase 4 now runs 19 October – 23 December 2026, with the decision requested by 16 October</w:t>
             </w:r>
           </w:p>
         </w:tc>
@@ -25966,7 +25966,7 @@
         <w:spacing w:after="140"/>
       </w:pPr>
       <w:r>
-        <w:t>Three phases are complete. Phase 4 is what this proposal asks approval for: ten weeks from 19 October to 27 December 2026, closing the open objectives and adding coaching.</w:t>
+        <w:t>Three phases are complete. Phase 4 is what this proposal asks approval for: ten weeks from 19 October to 23 December 2026, closing the open objectives and adding coaching. The release week is cut to three days so that v1.0 ships before Christmas; like every week in the plan, it is about five hours of work.</w:t>
       </w:r>
     </w:p>
     <w:p>
@@ -27258,7 +27258,7 @@
                 <w:sz w:val="18"/>
                 <w:szCs w:val="18"/>
               </w:rPr>
-              <w:t>21–27 Dec</w:t>
+              <w:t>21–23 Dec</w:t>
             </w:r>
           </w:p>
         </w:tc>
@@ -28149,7 +28149,7 @@
                 <w:sz w:val="18"/>
                 <w:szCs w:val="18"/>
               </w:rPr>
-              <w:t>2026-12-27</w:t>
+              <w:t>2026-12-23</w:t>
             </w:r>
           </w:p>
         </w:tc>

</xml_diff>

<commit_message>
Proposal: decision next week, Phase 4 in nine weeks
The decision moves from Friday 16 to Friday 23 October, so Phase 4 now
starts Monday 26 October. To keep v1.0 before Christmas (23 December),
the plan becomes nine weeks: coaching gets three weeks instead of four,
and the same ~50 hours run at about 5½ hours a week.

- Weeks: 1 · 26 Oct – 1 Nov, 2–3 · 2–15 Nov, 4–5 · 16–29 Nov,
  6–8 · 30 Nov – 20 Dec, 9 · 21–23 Dec.
- Milestones MS-1 to MS-4 move with them; MS-5 and MS-6 are unchanged.
- "Ten weeks" becomes "nine weeks" in the ask, the summary, the plan,
  the budget, the conclusion and the decision table.

Folded into revision 4. The PDF is re-exported with WPS; its contents
page numbers are unchanged.

Co-Authored-By: Claude Opus 5.5 <noreply@anthropic.com>
</commit_message>
<xml_diff>
--- a/docs/FunType-Project-Proposal.docx
+++ b/docs/FunType-Project-Proposal.docx
@@ -415,7 +415,7 @@
                 <w:sz w:val="18"/>
                 <w:szCs w:val="18"/>
               </w:rPr>
-              <w:t>16 October 2026</w:t>
+              <w:t>23 October 2026</w:t>
             </w:r>
           </w:p>
         </w:tc>
@@ -629,7 +629,7 @@
                 <w:sz w:val="22"/>
                 <w:szCs w:val="22"/>
               </w:rPr>
-              <w:t>Approval for a ten-week Phase 4 — freeze and test the measurement model, triple the drill content, add history and export, and build per-key coaching — with one part-time developer (about 50 hours) and RM 0 committed.</w:t>
+              <w:t>Approval for a nine-week Phase 4 — freeze and test the measurement model, triple the drill content, add history and export, and build per-key coaching — with one part-time developer (about 50 hours) and RM 0 committed.</w:t>
             </w:r>
           </w:p>
         </w:tc>
@@ -934,7 +934,7 @@
                 <w:sz w:val="18"/>
                 <w:szCs w:val="18"/>
               </w:rPr>
-              <w:t>Submitted for approval — decision requested by 16 October 2026</w:t>
+              <w:t>Submitted for approval — decision requested by 23 October 2026</w:t>
             </w:r>
           </w:p>
         </w:tc>
@@ -1691,7 +1691,7 @@
                 <w:sz w:val="18"/>
                 <w:szCs w:val="18"/>
               </w:rPr>
-              <w:t xml:space="preserve">): the on-screen guard now compares text only and stands down for browser extensions, which had frozen the last second of a test. Risk R13 and test TC-19 added; sizes, line counts and line ranges refreshed. The plan moved three weeks later, with the release week cut to three days so v1.0 ships before Christmas: Phase 4 now runs 19 October – 23 December 2026, with the decision requested by 16 October</w:t>
+              <w:t xml:space="preserve">): the on-screen guard now compares text only and stands down for browser extensions, which had frozen the last second of a test. Risk R13 and test TC-19 added; sizes, line counts and line ranges refreshed. The plan re-dated: the decision is requested by 23 October, and Phase 4 runs nine weeks from 26 October to 23 December 2026 so that v1.0 ships before Christmas — coaching has three weeks instead of four, at the same 50 hours</w:t>
             </w:r>
           </w:p>
         </w:tc>
@@ -7952,7 +7952,7 @@
                 <w:sz w:val="18"/>
                 <w:szCs w:val="18"/>
               </w:rPr>
-              <w:t>10 weeks: freeze and test the measurement model, triple the content, add history, build per-key coaching</w:t>
+              <w:t>9 weeks: freeze and test the measurement model, triple the content, add history, build per-key coaching</w:t>
             </w:r>
           </w:p>
         </w:tc>
@@ -7975,7 +7975,7 @@
         <w:t>The ask.</w:t>
       </w:r>
       <w:r>
-        <w:t xml:space="preserve"> Approval to run the ten-week Phase 4 in </w:t>
+        <w:t xml:space="preserve"> Approval to run the nine-week Phase 4 in </w:t>
       </w:r>
       <w:hyperlink w:anchor="s_project_plan_and_timeline" w:history="1">
         <w:r>
@@ -25966,7 +25966,7 @@
         <w:spacing w:after="140"/>
       </w:pPr>
       <w:r>
-        <w:t>Three phases are complete. Phase 4 is what this proposal asks approval for: ten weeks from 19 October to 23 December 2026, closing the open objectives and adding coaching. The release week is cut to three days so that v1.0 ships before Christmas; like every week in the plan, it is about five hours of work.</w:t>
+        <w:t>Three phases are complete. Phase 4 is what this proposal asks approval for: nine weeks from 26 October to 23 December 2026, closing the open objectives and adding coaching. To ship v1.0 before Christmas, coaching has three weeks rather than four and the release week is cut to three days; the plan keeps its 50 hours by running at about 5½ hours a week.</w:t>
       </w:r>
     </w:p>
     <w:p>
@@ -26712,7 +26712,7 @@
                 <w:sz w:val="18"/>
                 <w:szCs w:val="18"/>
               </w:rPr>
-              <w:t>19–25 Oct</w:t>
+              <w:t>26 Oct – 1 Nov</w:t>
             </w:r>
           </w:p>
         </w:tc>
@@ -26854,7 +26854,7 @@
                 <w:sz w:val="18"/>
                 <w:szCs w:val="18"/>
               </w:rPr>
-              <w:t>26 Oct – 8 Nov</w:t>
+              <w:t>2–15 Nov</w:t>
             </w:r>
           </w:p>
         </w:tc>
@@ -26978,7 +26978,7 @@
                 <w:sz w:val="18"/>
                 <w:szCs w:val="18"/>
               </w:rPr>
-              <w:t>9–22 Nov</w:t>
+              <w:t>16–29 Nov</w:t>
             </w:r>
           </w:p>
         </w:tc>
@@ -27110,7 +27110,7 @@
                 <w:sz w:val="18"/>
                 <w:szCs w:val="18"/>
               </w:rPr>
-              <w:t>6–9</w:t>
+              <w:t>6–8</w:t>
             </w:r>
           </w:p>
         </w:tc>
@@ -27136,7 +27136,7 @@
                 <w:sz w:val="18"/>
                 <w:szCs w:val="18"/>
               </w:rPr>
-              <w:t>23 Nov – 20 Dec</w:t>
+              <w:t>30 Nov – 20 Dec</w:t>
             </w:r>
           </w:p>
         </w:tc>
@@ -27233,7 +27233,7 @@
                 <w:sz w:val="18"/>
                 <w:szCs w:val="18"/>
               </w:rPr>
-              <w:t>10</w:t>
+              <w:t>9</w:t>
             </w:r>
           </w:p>
         </w:tc>
@@ -27577,7 +27577,7 @@
                 <w:sz w:val="18"/>
                 <w:szCs w:val="18"/>
               </w:rPr>
-              <w:t>2026-10-23</w:t>
+              <w:t>2026-10-30</w:t>
             </w:r>
           </w:p>
         </w:tc>
@@ -27692,7 +27692,7 @@
                 <w:sz w:val="18"/>
                 <w:szCs w:val="18"/>
               </w:rPr>
-              <w:t>2026-10-25</w:t>
+              <w:t>2026-11-01</w:t>
             </w:r>
           </w:p>
         </w:tc>
@@ -27807,7 +27807,7 @@
                 <w:sz w:val="18"/>
                 <w:szCs w:val="18"/>
               </w:rPr>
-              <w:t>2026-11-08</w:t>
+              <w:t>2026-11-15</w:t>
             </w:r>
           </w:p>
         </w:tc>
@@ -27922,7 +27922,7 @@
                 <w:sz w:val="18"/>
                 <w:szCs w:val="18"/>
               </w:rPr>
-              <w:t>2026-11-22</w:t>
+              <w:t>2026-11-29</w:t>
             </w:r>
           </w:p>
         </w:tc>
@@ -34746,7 +34746,7 @@
                 <w:sz w:val="18"/>
                 <w:szCs w:val="18"/>
               </w:rPr>
-              <w:t>A visible hint, checked in the week 10 accessibility pass</w:t>
+              <w:t>A visible hint, checked in the week 9 accessibility pass</w:t>
             </w:r>
           </w:p>
         </w:tc>
@@ -34998,7 +34998,7 @@
                 <w:sz w:val="18"/>
                 <w:szCs w:val="18"/>
               </w:rPr>
-              <w:t xml:space="preserve">About 5 hours a week for 10 weeks — </w:t>
+              <w:t xml:space="preserve">About 5½ hours a week for 9 weeks — </w:t>
             </w:r>
             <w:r>
               <w:rPr>
@@ -37684,7 +37684,7 @@
         <w:spacing w:after="140"/>
       </w:pPr>
       <w:r>
-        <w:t>FunType already works. It is live, it measures honestly with every formula published, it keeps a separate record for every configuration, it costs RM 0 a month, and since 23 September it resists the ways a local-only trainer's scores can actually be faked. What this proposal asks for is not a build from nothing — it is ten weeks to prove the numbers by test, make the content deep enough that the numbers stay honest, and then turn them into coaching.</w:t>
+        <w:t>FunType already works. It is live, it measures honestly with every formula published, it keeps a separate record for every configuration, it costs RM 0 a month, and since 23 September it resists the ways a local-only trainer's scores can actually be faked. What this proposal asks for is not a build from nothing — it is nine weeks to prove the numbers by test, make the content deep enough that the numbers stay honest, and then turn them into coaching.</w:t>
       </w:r>
     </w:p>
     <w:p>
@@ -37732,7 +37732,7 @@
         <w:t>The remaining scope is small and known.</w:t>
       </w:r>
       <w:r>
-        <w:t xml:space="preserve"> One week to freeze and test the model, two for content, two for history and export, four for coaching, one to release.</w:t>
+        <w:t xml:space="preserve"> One week to freeze and test the model, two for content, two for history and export, three for coaching, and three days to release.</w:t>
       </w:r>
     </w:p>
     <w:p>
@@ -37856,7 +37856,7 @@
                 <w:sz w:val="18"/>
                 <w:szCs w:val="18"/>
               </w:rPr>
-              <w:t>Phase 4 as scoped — 10 weeks, about 50 hours, one developer</w:t>
+              <w:t>Phase 4 as scoped — 9 weeks, about 50 hours, one developer</w:t>
             </w:r>
           </w:p>
         </w:tc>
@@ -37988,7 +37988,7 @@
                 <w:sz w:val="18"/>
                 <w:szCs w:val="18"/>
               </w:rPr>
-              <w:t>2026-10-16</w:t>
+              <w:t>2026-10-23</w:t>
             </w:r>
           </w:p>
         </w:tc>
@@ -38052,7 +38052,7 @@
                 <w:sz w:val="18"/>
                 <w:szCs w:val="18"/>
               </w:rPr>
-              <w:t>2026-10-19</w:t>
+              <w:t>2026-10-26</w:t>
             </w:r>
           </w:p>
         </w:tc>

</xml_diff>